<commit_message>
Light, warmer theme and corrected test counts
Dropped the dark mode. The greens in the light palette were all cool-tinted,
which read clinical, so the neutrals are now a warm cream with soft warm-grey
borders and a slightly softer green. Pinned color-scheme to light so browsers
do not adapt it.

The résumé buttons wrapped onto a second row; there is one now, with the Word
version offered in a line underneath along with what she is open to.

Counts corrected to 30 after the framework's login tests stopped being
parametrised across six accounts that had to already exist on a shared public
site. Same coverage, eighteen fewer duplicate cases.
</commit_message>
<xml_diff>
--- a/Priya_Bhagoriya_Resume.docx
+++ b/Priya_Bhagoriya_Resume.docx
@@ -786,7 +786,7 @@
           <w:color w:val="1A1A1A"/>
           <w:sz w:val="20"/>
         </w:rPr>
-        <w:t>45 tests across UI and API, running in Docker on GitHub Actions, publishing a live Allure report with trend history, per-step detail, screenshots and traces.</w:t>
+        <w:t>30 tests across UI and API, running in Docker on GitHub Actions, publishing a live Allure report with trend history, per-step detail, screenshots and traces.</w:t>
       </w:r>
     </w:p>
     <w:p>
@@ -834,7 +834,7 @@
           <w:color w:val="1A1A1A"/>
           <w:sz w:val="20"/>
         </w:rPr>
-        <w:t>Found and fixed a defect where parallel workers split results across two folders, so the published report could silently contain half the run.</w:t>
+        <w:t>Found and fixed three real defects: parallel workers split results across two folders so the published report could contain half a run; the signup flow appended every account it created to committed test data, growing the suite each time; and several waits used a 5s default instead of the configured 20s.</w:t>
       </w:r>
     </w:p>
     <w:p>

</xml_diff>

<commit_message>
Update the resume, and say check.py needs Playwright
Four lines had stopped being true: Pydantic under skills, "CLI, GitHub Action
and hosted API", the generator's validation described as Pydantic, and 43 API
tests. The DOCX is the source and the PDF is reconverted from it with soffice;
pdftotext confirms only those four lines moved and it is still two pages.

The README's "Before pushing" block ran check.py without saying it needs
Playwright, which is the repository's only check and had no declared dependency.
</commit_message>
<xml_diff>
--- a/Priya_Bhagoriya_Resume.docx
+++ b/Priya_Bhagoriya_Resume.docx
@@ -140,7 +140,7 @@
           <w:color w:val="1A1A1A"/>
           <w:sz w:val="20"/>
         </w:rPr>
-        <w:t>Evaluating non-deterministic output, property-based assertions over generated content, provider fallback and graceful degradation, token-budget and rate-limit design, structured output validation with Pydantic, prompt versioning, LLM-assisted test generation, self-healing locators</w:t>
+        <w:t>Evaluating non-deterministic output, property-based assertions over generated content, provider fallback and graceful degradation, token-budget and rate-limit design, structured output validation and contract checks, prompt versioning, LLM-assisted test generation, self-healing locators</w:t>
       </w:r>
     </w:p>
     <w:p>
@@ -848,7 +848,7 @@
           <w:color w:val="1A1A1A"/>
           <w:sz w:val="21"/>
         </w:rPr>
-        <w:t>AI Code Review — CLI, GitHub Action and hosted API</w:t>
+        <w:t xml:space="preserve">AI Code Review — CLI and GitHub Action   </w:t>
       </w:r>
       <w:r>
         <w:rPr>
@@ -857,7 +857,7 @@
           <w:color w:val="1B365D"/>
           <w:sz w:val="18"/>
         </w:rPr>
-        <w:t xml:space="preserve">   github.com/Priya123z/ai-code-review</w:t>
+        <w:t>github.com/Priya123z/ai-code-review</w:t>
       </w:r>
     </w:p>
     <w:p>
@@ -967,7 +967,7 @@
           <w:color w:val="1A1A1A"/>
           <w:sz w:val="20"/>
         </w:rPr>
-        <w:t xml:space="preserve">•  </w:t>
+        <w:t>•  Turns a written requirement into Gherkin scenarios and Pytest skeletons, checked against one contract shared by the library and the browser demo, so malformed model output fails loudly instead of producing broken tests.</w:t>
       </w:r>
       <w:r>
         <w:rPr>
@@ -976,7 +976,6 @@
           <w:color w:val="1A1A1A"/>
           <w:sz w:val="20"/>
         </w:rPr>
-        <w:t>Turns a written requirement into Gherkin scenarios and Pytest skeletons, validated through Pydantic so malformed model output fails loudly instead of producing broken tests.</w:t>
       </w:r>
     </w:p>
     <w:p>
@@ -1038,7 +1037,7 @@
           <w:color w:val="1A1A1A"/>
           <w:sz w:val="20"/>
         </w:rPr>
-        <w:t xml:space="preserve">•  </w:t>
+        <w:t>•  42 Pytest tests over CRUD and auth flows with JSON Schema validation, publishing a live HTML report from CI, plus a nightly run to catch the upstream API changing shape.</w:t>
       </w:r>
       <w:r>
         <w:rPr>
@@ -1047,7 +1046,6 @@
           <w:color w:val="1A1A1A"/>
           <w:sz w:val="20"/>
         </w:rPr>
-        <w:t>43 Pytest tests over CRUD and auth flows with JSON Schema validation, publishing a live HTML report from CI, plus a nightly run to catch the upstream API changing shape.</w:t>
       </w:r>
     </w:p>
     <w:p>

</xml_diff>